<commit_message>
New parts in serial actuator model
</commit_message>
<xml_diff>
--- a/Documents/Техническое задание.docx
+++ b/Documents/Техническое задание.docx
@@ -33,7 +33,29 @@
           <w:szCs w:val="36"/>
           <w:u w:val="single"/>
         </w:rPr>
-        <w:t>на робота «Морковная булочка»</w:t>
+        <w:t xml:space="preserve">на робота «Морковная </w:t>
+      </w:r>
+      <w:r>
+        <w:rPr>
+          <w:rFonts w:ascii="Times New Roman" w:hAnsi="Times New Roman" w:cs="Times New Roman"/>
+          <w:b/>
+          <w:color w:val="0070C0"/>
+          <w:sz w:val="36"/>
+          <w:szCs w:val="36"/>
+          <w:u w:val="single"/>
+        </w:rPr>
+        <w:t>палочка</w:t>
+      </w:r>
+      <w:r>
+        <w:rPr>
+          <w:rFonts w:ascii="Times New Roman" w:hAnsi="Times New Roman" w:cs="Times New Roman"/>
+          <w:b/>
+          <w:color w:val="0070C0"/>
+          <w:sz w:val="36"/>
+          <w:szCs w:val="36"/>
+          <w:u w:val="single"/>
+        </w:rPr>
+        <w:t>»</w:t>
       </w:r>
     </w:p>
     <w:p>
@@ -150,9 +172,8 @@
           <w:sz w:val="28"/>
           <w:szCs w:val="28"/>
         </w:rPr>
-        <w:t xml:space="preserve">Морковная Булочка это интерактивная платформа, управляемая </w:t>
-      </w:r>
-      <w:proofErr w:type="spellStart"/>
+        <w:t xml:space="preserve">Морковная </w:t>
+      </w:r>
       <w:r>
         <w:rPr>
           <w:rFonts w:ascii="Times New Roman" w:hAnsi="Times New Roman" w:cs="Times New Roman"/>
@@ -161,9 +182,8 @@
           <w:sz w:val="28"/>
           <w:szCs w:val="28"/>
         </w:rPr>
-        <w:t>нейросетью</w:t>
-      </w:r>
-      <w:proofErr w:type="spellEnd"/>
+        <w:t>Палочка</w:t>
+      </w:r>
       <w:r>
         <w:rPr>
           <w:rFonts w:ascii="Times New Roman" w:hAnsi="Times New Roman" w:cs="Times New Roman"/>
@@ -172,7 +192,7 @@
           <w:sz w:val="28"/>
           <w:szCs w:val="28"/>
         </w:rPr>
-        <w:t xml:space="preserve">. Если бы у </w:t>
+        <w:t xml:space="preserve"> это интерактивная платформа, управляемая </w:t>
       </w:r>
       <w:proofErr w:type="spellStart"/>
       <w:r>
@@ -183,7 +203,7 @@
           <w:sz w:val="28"/>
           <w:szCs w:val="28"/>
         </w:rPr>
-        <w:t>керфура</w:t>
+        <w:t>нейросетью</w:t>
       </w:r>
       <w:proofErr w:type="spellEnd"/>
       <w:r>
@@ -194,7 +214,7 @@
           <w:sz w:val="28"/>
           <w:szCs w:val="28"/>
         </w:rPr>
-        <w:t xml:space="preserve"> была локальная </w:t>
+        <w:t xml:space="preserve">. Если бы у </w:t>
       </w:r>
       <w:proofErr w:type="spellStart"/>
       <w:r>
@@ -205,7 +225,7 @@
           <w:sz w:val="28"/>
           <w:szCs w:val="28"/>
         </w:rPr>
-        <w:t>llm</w:t>
+        <w:t>керфура</w:t>
       </w:r>
       <w:proofErr w:type="spellEnd"/>
       <w:r>
@@ -216,7 +236,49 @@
           <w:sz w:val="28"/>
           <w:szCs w:val="28"/>
         </w:rPr>
-        <w:t xml:space="preserve"> и манипулятор, он бы был Морковной Булочкой.</w:t>
+        <w:t xml:space="preserve"> была локальная </w:t>
+      </w:r>
+      <w:proofErr w:type="spellStart"/>
+      <w:r>
+        <w:rPr>
+          <w:rFonts w:ascii="Times New Roman" w:hAnsi="Times New Roman" w:cs="Times New Roman"/>
+          <w:i/>
+          <w:iCs/>
+          <w:sz w:val="28"/>
+          <w:szCs w:val="28"/>
+        </w:rPr>
+        <w:t>llm</w:t>
+      </w:r>
+      <w:proofErr w:type="spellEnd"/>
+      <w:r>
+        <w:rPr>
+          <w:rFonts w:ascii="Times New Roman" w:hAnsi="Times New Roman" w:cs="Times New Roman"/>
+          <w:i/>
+          <w:iCs/>
+          <w:sz w:val="28"/>
+          <w:szCs w:val="28"/>
+        </w:rPr>
+        <w:t xml:space="preserve"> и манипулятор, он бы был Морковной </w:t>
+      </w:r>
+      <w:r>
+        <w:rPr>
+          <w:rFonts w:ascii="Times New Roman" w:hAnsi="Times New Roman" w:cs="Times New Roman"/>
+          <w:i/>
+          <w:iCs/>
+          <w:sz w:val="28"/>
+          <w:szCs w:val="28"/>
+        </w:rPr>
+        <w:t>Палочкой</w:t>
+      </w:r>
+      <w:r>
+        <w:rPr>
+          <w:rFonts w:ascii="Times New Roman" w:hAnsi="Times New Roman" w:cs="Times New Roman"/>
+          <w:i/>
+          <w:iCs/>
+          <w:sz w:val="28"/>
+          <w:szCs w:val="28"/>
+        </w:rPr>
+        <w:t>.</w:t>
       </w:r>
     </w:p>
     <w:p>
@@ -1241,6 +1303,7 @@
   <w:style w:type="character" w:default="1" w:styleId="a0">
     <w:name w:val="Default Paragraph Font"/>
     <w:uiPriority w:val="1"/>
+    <w:semiHidden/>
     <w:unhideWhenUsed/>
   </w:style>
   <w:style w:type="table" w:default="1" w:styleId="a1">

</xml_diff>